<commit_message>
2025-04-11 - Casos de Prueba Aceptados (Segunda Daily Review)
Se agregó el documento con los casos de prueba correspondientes a las tareas aceptadas hasta la fecha.

Documento generado y revisado durante la segunda daily review.
</commit_message>
<xml_diff>
--- a/docs/documentacion/Sprint_3/Daily 02_[11-04-2025] .docx
+++ b/docs/documentacion/Sprint_3/Daily 02_[11-04-2025] .docx
@@ -578,6 +578,12 @@
         </w:rPr>
         <w:t>10:00</w:t>
       </w:r>
+      <w:r>
+        <w:rPr>
+          <w:rFonts w:eastAsia="Arial Unicode MS"/>
+        </w:rPr>
+        <w:t xml:space="preserve"> am</w:t>
+      </w:r>
     </w:p>
     <w:p>
       <w:pPr>
@@ -1669,40 +1675,7 @@
                 <w:szCs w:val="20"/>
                 <w:lang w:val="es-ES"/>
               </w:rPr>
-              <w:t xml:space="preserve"> </w:t>
-            </w:r>
-            <w:r>
-              <w:rPr>
-                <w:rFonts w:eastAsia="Arial Unicode MS"/>
-                <w:b/>
-                <w:bCs/>
-                <w:sz w:val="20"/>
-                <w:szCs w:val="20"/>
-                <w:lang w:val="es-ES"/>
-              </w:rPr>
-              <w:t>SDI-93</w:t>
-            </w:r>
-            <w:r>
-              <w:rPr>
-                <w:rFonts w:eastAsia="Arial Unicode MS"/>
-                <w:b/>
-                <w:bCs/>
-                <w:sz w:val="20"/>
-                <w:szCs w:val="20"/>
-                <w:lang w:val="es-ES"/>
-              </w:rPr>
-              <w:t xml:space="preserve"> – Task: </w:t>
-            </w:r>
-            <w:r>
-              <w:rPr>
-                <w:rFonts w:eastAsia="Arial Unicode MS"/>
-                <w:b/>
-                <w:bCs/>
-                <w:sz w:val="20"/>
-                <w:szCs w:val="20"/>
-                <w:lang w:val="es-ES"/>
-              </w:rPr>
-              <w:t>SDI-104:</w:t>
+              <w:t xml:space="preserve"> SDI-93 – Task: SDI-104:</w:t>
             </w:r>
           </w:p>
           <w:p>
@@ -1748,40 +1721,7 @@
                 <w:szCs w:val="20"/>
                 <w:lang w:val="es-ES"/>
               </w:rPr>
-              <w:t xml:space="preserve">HU: </w:t>
-            </w:r>
-            <w:r>
-              <w:rPr>
-                <w:rFonts w:eastAsia="Arial Unicode MS"/>
-                <w:b/>
-                <w:bCs/>
-                <w:sz w:val="20"/>
-                <w:szCs w:val="20"/>
-                <w:lang w:val="es-ES"/>
-              </w:rPr>
-              <w:t>SDI-93</w:t>
-            </w:r>
-            <w:r>
-              <w:rPr>
-                <w:rFonts w:eastAsia="Arial Unicode MS"/>
-                <w:b/>
-                <w:bCs/>
-                <w:sz w:val="20"/>
-                <w:szCs w:val="20"/>
-                <w:lang w:val="es-ES"/>
-              </w:rPr>
-              <w:t xml:space="preserve"> – Task </w:t>
-            </w:r>
-            <w:r>
-              <w:rPr>
-                <w:rFonts w:eastAsia="Arial Unicode MS"/>
-                <w:b/>
-                <w:bCs/>
-                <w:sz w:val="20"/>
-                <w:szCs w:val="20"/>
-                <w:lang w:val="es-ES"/>
-              </w:rPr>
-              <w:t>SDI-105:</w:t>
+              <w:t>HU: SDI-93 – Task SDI-105:</w:t>
             </w:r>
           </w:p>
           <w:p>
@@ -1838,29 +1778,7 @@
                 <w:szCs w:val="20"/>
                 <w:lang w:val="es-ES"/>
               </w:rPr>
-              <w:t xml:space="preserve">: </w:t>
-            </w:r>
-            <w:r>
-              <w:rPr>
-                <w:rFonts w:eastAsia="Arial Unicode MS"/>
-                <w:b/>
-                <w:bCs/>
-                <w:sz w:val="20"/>
-                <w:szCs w:val="20"/>
-                <w:lang w:val="es-ES"/>
-              </w:rPr>
-              <w:t>SDI-32</w:t>
-            </w:r>
-            <w:r>
-              <w:rPr>
-                <w:rFonts w:eastAsia="Arial Unicode MS"/>
-                <w:b/>
-                <w:bCs/>
-                <w:sz w:val="20"/>
-                <w:szCs w:val="20"/>
-                <w:lang w:val="es-ES"/>
-              </w:rPr>
-              <w:t xml:space="preserve"> –</w:t>
+              <w:t>: SDI-32 –</w:t>
             </w:r>
             <w:r>
               <w:rPr>

</xml_diff>